<commit_message>
Redesign Figure 1 flowchart
</commit_message>
<xml_diff>
--- a/submission/JPBI_publication_package/01_clean_manuscript.docx
+++ b/submission/JPBI_publication_package/01_clean_manuscript.docx
@@ -323,7 +323,7 @@
         </w:rPr>
         <w:drawing>
           <wp:inline xmlns:a="http://schemas.openxmlformats.org/drawingml/2006/main" xmlns:pic="http://schemas.openxmlformats.org/drawingml/2006/picture">
-            <wp:extent cx="5303520" cy="3371229"/>
+            <wp:extent cx="5303520" cy="3025376"/>
             <wp:docPr id="1" name="Picture 1"/>
             <wp:cNvGraphicFramePr>
               <a:graphicFrameLocks noChangeAspect="1"/>
@@ -344,7 +344,7 @@
                   <pic:spPr>
                     <a:xfrm>
                       <a:off x="0" y="0"/>
-                      <a:ext cx="5303520" cy="3371229"/>
+                      <a:ext cx="5303520" cy="3025376"/>
                     </a:xfrm>
                     <a:prstGeom prst="rect"/>
                   </pic:spPr>

</xml_diff>

<commit_message>
Correct split count and add both affiliations
</commit_message>
<xml_diff>
--- a/submission/JPBI_publication_package/01_clean_manuscript.docx
+++ b/submission/JPBI_publication_package/01_clean_manuscript.docx
@@ -36,11 +36,11 @@
           <w:color w:val="000000"/>
           <w:sz w:val="20"/>
         </w:rPr>
-        <w:t>Independent Researcher in Data Science and AI for Pharmaceutical Industry</w:t>
+        <w:t>Affiliation 1: Independent Researcher in Data Science and AI for Pharmaceutical Industry</w:t>
         <w:br/>
-        <w:t>Friedrich-Wilhelm 28, 12103 Berlin, Germany</w:t>
+        <w:t>Affiliation 2: Member of Brazil-Africa Group for Scientific Research and Writing (GPEC), Portuguese-Speaking African Countries (PALOPs)</w:t>
         <w:br/>
-        <w:t>Corresponding author: cmontefusco@gmail.com</w:t>
+        <w:t>Corresponding information: Friedrich-Wilhelm 28, 12103 Berlin, Germany; cmontefusco@gmail.com</w:t>
       </w:r>
     </w:p>
     <w:p>
@@ -131,7 +131,7 @@
           <w:color w:val="000000"/>
           <w:sz w:val="20"/>
         </w:rPr>
-        <w:t>Adding molecular assays may improve drug-response prediction, but the benefit may depend on the response resource, validation target, and data completeness. I compared expression-only and early-fusion Ridge models using expression, copy-number, and damaging-mutation features from GDSC1, GDSC2, and CTD². The declared benchmark contained 15 compounds. Feature selection, imputation, and scaling were performed within each training fold, followed by five grouped drug-held-out splits and leave-one-dataset-out transfer. Across the five drug-held-out splits, fusion had mean RMSE 0.2322 versus 0.2328 for expression alone, a mean difference of −0.0006. Fusion favored three splits and expression favored two. In the paired drug-group audit, the mean fusion-minus-expression difference was −0.0009 with a sample SD of 0.0019 across 15 drug-seed cells. Fusion was less favorable within each of the three source-held-out folds, although these folds change source, compound composition, cell lines, assay context, and response construction together. These results answer the research questions in a practical way: fusion may provide a small gain within the declared drug-response universe, but the gain is not stable across repeated splits; it was less favorable in the source-held-out transfer setting; and modality availability and redundancy are part of the result rather than secondary details. For early drug discovery, an additional assay should therefore be retained only when its incremental benefit is reproducible in the intended population, remains available across the evaluation set, and is confirmed by external validation. Expression remains a competitive reference, and this study does not support arbitrary new-drug prediction, clinical treatment selection, or causal biological claims.</w:t>
+        <w:t>Does adding more molecular data really improve cancer drug-response prediction? I tested this question using expression, copy-number, and damaging-mutation data from GDSC1, GDSC2, and CTD² across 15 compounds. I compared an expression-only Ridge model with a model that combined all three modalities. Feature selection, missing-value handling, and scaling were performed separately inside each training fold. In five grouped drug-held-out splits, the combined model had a mean RMSE of 0.2322 versus 0.2328 for expression alone, a difference of −0.0006. Fusion performed better in four splits and worse in one. However, fusion was less favorable in all three leave-one-dataset-out tests. Modality availability also differed across datasets, with copy-number data less consistently available than expression or mutation data. The practical conclusion is simple: additional assays should not be added automatically. They are worth retaining when their benefit is reproducible in the intended population, the data are available, and the gain remains after external validation. This study does not support arbitrary new-drug prediction, clinical treatment selection, or causal biological claims.</w:t>
       </w:r>
     </w:p>
     <w:p>
@@ -11564,7 +11564,7 @@
           <w:color w:val="000000"/>
           <w:sz w:val="20"/>
         </w:rPr>
-        <w:t>The drug-held-out result is compatible with a limited benefit from complementary features when the training and test rows share a source-defined response system. It should not be interpreted as evidence that the current cell-line-only model can predict responses for arbitrary new compounds, because it receives no drug-related input. Fusion improved the mean across five seeds, but only three of five seed-level comparisons favored fusion and the effect sizes were small relative to the absolute error. I therefore describe this result as uncertain, conditional evidence that fusion can be useful under a matched evaluation regime, not as evidence that fusion should replace a strong single-modality baseline.</w:t>
+        <w:t>The drug-held-out result is compatible with a limited benefit from complementary features when the training and test rows share a source-defined response system. It should not be interpreted as evidence that the current cell-line-only model can predict responses for arbitrary new compounds, because it receives no drug-related input. Fusion improved the mean across five seeds, but four of five seed-level comparisons favored fusion and the effect sizes were small relative to the absolute error. I therefore describe this result as uncertain, conditional evidence that fusion can be useful under a matched evaluation regime, not as evidence that fusion should replace a strong single-modality baseline.</w:t>
       </w:r>
     </w:p>
     <w:p>
@@ -13009,7 +13009,7 @@
                 <w:color w:val="000000"/>
                 <w:sz w:val="20"/>
               </w:rPr>
-              <w:t>Fusion improves in 3 of 5 drug-held-out seeds</w:t>
+              <w:t>Fusion improves in 4 of 5 drug-held-out seeds</w:t>
             </w:r>
           </w:p>
         </w:tc>

</xml_diff>